<commit_message>
v12.1.0: four regenerated sample files, previews re-rendered to match
Opportunities_SAMPLE.xlsx, CTC_Events_SAMPLE.xlsx and both Portland issue
files replace the hosted copies at the same paths and names. The
opportunities workbook no longer carries a Status or a Last used column, so
the excerpt on the Newsletter page drops its Status column. The events
workbook now flags a missing end time in Missing Info and notes where a map
link does not apply. The Portland issue's Upcoming Events are in date order.

Preview shows a render of the very file Download hands over, so the page
images and the opened-in-Excel and opened-in-Word captures for those three
files were re-taken from the new files. Page counts are unchanged; only the
opportunities sheet's height moved in DIMS.

The ctc-newsletter label stays at v2.0.0 because the hosted zip is v2.0.0.

Co-Authored-By: Claude Fable 5.1 <noreply@anthropic.com>
</commit_message>
<xml_diff>
--- a/downloads/samples/Portland_Climate_Tech_Aug_11-Aug_18.docx
+++ b/downloads/samples/Portland_Climate_Tech_Aug_11-Aug_18.docx
@@ -157,7 +157,7 @@
         </w:rPr>
         <w:t xml:space="preserve">get into the weeds on interconnection queues at </w:t>
       </w:r>
-      <w:hyperlink w:history="1" r:id="rIdm26kazbo2tem8mmwdtgah">
+      <w:hyperlink w:history="1" r:id="rIdoldybr3-hljgsywzw7adq">
         <w:r>
           <w:rPr>
             <w:rStyle w:val="Hyperlink"/>
@@ -184,7 +184,7 @@
         </w:rPr>
         <w:t xml:space="preserve"> or talk buildings over a beer at </w:t>
       </w:r>
-      <w:hyperlink w:history="1" r:id="rIde97iiy_t2pegtlx74istk">
+      <w:hyperlink w:history="1" r:id="rId-87b6atdtqjdn7mtxwci0">
         <w:r>
           <w:rPr>
             <w:rStyle w:val="Hyperlink"/>
@@ -233,7 +233,7 @@
         </w:rPr>
         <w:t xml:space="preserve">fix a toaster instead of sitting through a panel at the </w:t>
       </w:r>
-      <w:hyperlink w:history="1" r:id="rIdubb8nvmjl6zfx0-rb_7cw">
+      <w:hyperlink w:history="1" r:id="rIdwdc4i58tepqexfxiboob-">
         <w:r>
           <w:rPr>
             <w:rStyle w:val="Hyperlink"/>
@@ -282,7 +282,7 @@
         </w:rPr>
         <w:t xml:space="preserve">pull invasive ivy out of the riverbank at the </w:t>
       </w:r>
-      <w:hyperlink w:history="1" r:id="rIdpf-mwaxbzsz2a_oqmlsvx">
+      <w:hyperlink w:history="1" r:id="rIdskjfkupbavbmbsppznhww">
         <w:r>
           <w:rPr>
             <w:rStyle w:val="Hyperlink"/>
@@ -343,7 +343,7 @@
         </w:rPr>
         <w:t xml:space="preserve">bring your questions to </w:t>
       </w:r>
-      <w:hyperlink w:history="1" r:id="rIdwxbve858uubcsqv32kwcz">
+      <w:hyperlink w:history="1" r:id="rIdoufptzt-ijpeomyz-t4tg">
         <w:r>
           <w:rPr>
             <w:rStyle w:val="Hyperlink"/>
@@ -509,7 +509,7 @@
         </w:numPr>
         <w:spacing w:after="140" w:line="300"/>
       </w:pPr>
-      <w:hyperlink w:history="1" r:id="rIdoivtbdw0rnsv96z8svj-f">
+      <w:hyperlink w:history="1" r:id="rId8z5eu56msqaozl29drujy">
         <w:r>
           <w:rPr>
             <w:rStyle w:val="Hyperlink"/>
@@ -534,7 +534,7 @@
         </w:numPr>
         <w:spacing w:after="140" w:line="300"/>
       </w:pPr>
-      <w:hyperlink w:history="1" r:id="rIduv9pa2jttuuw9pzt6pdk_">
+      <w:hyperlink w:history="1" r:id="rIdo9t7i4s-sdxb8x1iujw7d">
         <w:r>
           <w:rPr>
             <w:rStyle w:val="Hyperlink"/>
@@ -579,7 +579,7 @@
         <w:pStyle w:val="Heading3"/>
         <w:spacing w:after="120" w:before="320"/>
       </w:pPr>
-      <w:hyperlink w:history="1" r:id="rIdbsrzpywmeraeyd4d8q6yz">
+      <w:hyperlink w:history="1" r:id="rIdzcyl6oeohxbosdislibhy">
         <w:r>
           <w:rPr>
             <w:rStyle w:val="Hyperlink"/>
@@ -675,7 +675,7 @@
         </w:numPr>
         <w:spacing w:after="140" w:line="300"/>
       </w:pPr>
-      <w:hyperlink w:history="1" r:id="rIdqxedj26jgejiqkqcwmjp9">
+      <w:hyperlink w:history="1" r:id="rIddafk3vkxpszjia_6t100u">
         <w:r>
           <w:rPr>
             <w:rStyle w:val="Hyperlink"/>
@@ -700,7 +700,7 @@
         </w:numPr>
         <w:spacing w:after="140" w:line="300"/>
       </w:pPr>
-      <w:hyperlink w:history="1" r:id="rIdbchktku-ebcdld92ioevu">
+      <w:hyperlink w:history="1" r:id="rIdxyjvjasvf95iv41abmrzw">
         <w:r>
           <w:rPr>
             <w:rStyle w:val="Hyperlink"/>
@@ -725,7 +725,7 @@
         </w:numPr>
         <w:spacing w:after="140" w:line="300"/>
       </w:pPr>
-      <w:hyperlink w:history="1" r:id="rIdnjvoljqr_kx6vrdvyj7s6">
+      <w:hyperlink w:history="1" r:id="rIdzh9wg6vcjbdzrd0xzbjet">
         <w:r>
           <w:rPr>
             <w:rStyle w:val="Hyperlink"/>
@@ -766,7 +766,7 @@
         </w:numPr>
         <w:spacing w:after="140" w:line="300"/>
       </w:pPr>
-      <w:hyperlink w:history="1" r:id="rIdlps64paslniytk8xjwsyt">
+      <w:hyperlink w:history="1" r:id="rId4zl5easjvjw4zog9znmxn">
         <w:r>
           <w:rPr>
             <w:rStyle w:val="Hyperlink"/>
@@ -791,7 +791,7 @@
         </w:numPr>
         <w:spacing w:after="140" w:line="300"/>
       </w:pPr>
-      <w:hyperlink w:history="1" r:id="rIdqotctfeystwjyxpb3_5_l">
+      <w:hyperlink w:history="1" r:id="rId25n6chym_v5-kzlztbgqg">
         <w:r>
           <w:rPr>
             <w:rStyle w:val="Hyperlink"/>
@@ -832,7 +832,7 @@
         </w:numPr>
         <w:spacing w:after="140" w:line="300"/>
       </w:pPr>
-      <w:hyperlink w:history="1" r:id="rIdabpvpodbgwwkkiha--ahd">
+      <w:hyperlink w:history="1" r:id="rId-tgauvhgsulm6n9x2p70f">
         <w:r>
           <w:rPr>
             <w:rStyle w:val="Hyperlink"/>
@@ -857,7 +857,7 @@
         </w:numPr>
         <w:spacing w:after="140" w:line="300"/>
       </w:pPr>
-      <w:hyperlink w:history="1" r:id="rIdlsptrzyla-ej4txzpcqm9">
+      <w:hyperlink w:history="1" r:id="rId5aldpajenjn_ee-07jyl1">
         <w:r>
           <w:rPr>
             <w:rStyle w:val="Hyperlink"/>
@@ -898,7 +898,7 @@
         </w:numPr>
         <w:spacing w:after="140" w:line="300"/>
       </w:pPr>
-      <w:hyperlink w:history="1" r:id="rIdvni7xiomg3nh1b5hwng2x">
+      <w:hyperlink w:history="1" r:id="rIdqasyldoeogbstddupxd0e">
         <w:r>
           <w:rPr>
             <w:rStyle w:val="Hyperlink"/>
@@ -923,7 +923,7 @@
         </w:numPr>
         <w:spacing w:after="140" w:line="300"/>
       </w:pPr>
-      <w:hyperlink w:history="1" r:id="rIduq2gv-b4io0kvuxkgpxs8">
+      <w:hyperlink w:history="1" r:id="rIdqeyl9ungnidc5nw93oooq">
         <w:r>
           <w:rPr>
             <w:rStyle w:val="Hyperlink"/>
@@ -972,7 +972,7 @@
         </w:numPr>
         <w:spacing w:after="140" w:line="300"/>
       </w:pPr>
-      <w:hyperlink w:history="1" r:id="rId3etu13np0nkfy0v9fresa">
+      <w:hyperlink w:history="1" r:id="rIdx4ccpxvtefsrs-hiqvugl">
         <w:r>
           <w:rPr>
             <w:rStyle w:val="Hyperlink"/>
@@ -1009,7 +1009,7 @@
         </w:numPr>
         <w:spacing w:after="140" w:line="300"/>
       </w:pPr>
-      <w:hyperlink w:history="1" r:id="rIdefpdgzuarl2h9bx8ksbar">
+      <w:hyperlink w:history="1" r:id="rIdm_by9xmp-7wm_ozfbwliy">
         <w:r>
           <w:rPr>
             <w:rStyle w:val="Hyperlink"/>
@@ -1046,7 +1046,7 @@
         </w:numPr>
         <w:spacing w:after="140" w:line="300"/>
       </w:pPr>
-      <w:hyperlink w:history="1" r:id="rId-_yiavudnfhq4m7amlbld">
+      <w:hyperlink w:history="1" r:id="rIdbak_s8xtpzyuuqnuj8wrc">
         <w:r>
           <w:rPr>
             <w:rStyle w:val="Hyperlink"/>
@@ -1083,7 +1083,7 @@
         </w:numPr>
         <w:spacing w:after="140" w:line="300"/>
       </w:pPr>
-      <w:hyperlink w:history="1" r:id="rIdx8glmoibu_7uy7bdtbslb">
+      <w:hyperlink w:history="1" r:id="rIda_sipngcw3_12lhoibt3h">
         <w:r>
           <w:rPr>
             <w:rStyle w:val="Hyperlink"/>
@@ -1120,7 +1120,7 @@
         </w:numPr>
         <w:spacing w:after="140" w:line="300"/>
       </w:pPr>
-      <w:hyperlink w:history="1" r:id="rIdye5u0abcuyxsutoput-zn">
+      <w:hyperlink w:history="1" r:id="rIdtnrje4ve3pcem2se-x1j1">
         <w:r>
           <w:rPr>
             <w:rStyle w:val="Hyperlink"/>
@@ -1157,7 +1157,7 @@
         </w:numPr>
         <w:spacing w:after="140" w:line="300"/>
       </w:pPr>
-      <w:hyperlink w:history="1" r:id="rIdr7golfjnzw1zj2mdvkpml">
+      <w:hyperlink w:history="1" r:id="rId6eoztzg-wudcwxzq1c3ig">
         <w:r>
           <w:rPr>
             <w:rStyle w:val="Hyperlink"/>
@@ -1194,32 +1194,32 @@
         </w:numPr>
         <w:spacing w:after="140" w:line="300"/>
       </w:pPr>
-      <w:hyperlink w:history="1" r:id="rIdubl61il2f87jia_kqx5wf">
-        <w:r>
-          <w:rPr>
-            <w:rStyle w:val="Hyperlink"/>
-            <w:rFonts w:ascii="Georgia" w:cs="Georgia" w:eastAsia="Georgia" w:hAnsi="Georgia"/>
-            <w:b w:val="false"/>
-            <w:bCs w:val="false"/>
-            <w:i w:val="false"/>
-            <w:iCs w:val="false"/>
-            <w:sz w:val="26"/>
-            <w:szCs w:val="26"/>
-          </w:rPr>
-          <w:t xml:space="preserve">🌱 Soil Carbon Field Day</w:t>
-        </w:r>
-      </w:hyperlink>
-      <w:r>
-        <w:rPr>
-          <w:rFonts w:ascii="Georgia" w:cs="Georgia" w:eastAsia="Georgia" w:hAnsi="Georgia"/>
-          <w:b w:val="false"/>
-          <w:bCs w:val="false"/>
-          <w:i w:val="false"/>
-          <w:iCs w:val="false"/>
-          <w:sz w:val="26"/>
-          <w:szCs w:val="26"/>
-        </w:rPr>
-        <w:t xml:space="preserve">: Sep 4</w:t>
+      <w:hyperlink w:history="1" r:id="rIdsm86r7_i5gzey6whtgflp">
+        <w:r>
+          <w:rPr>
+            <w:rStyle w:val="Hyperlink"/>
+            <w:rFonts w:ascii="Georgia" w:cs="Georgia" w:eastAsia="Georgia" w:hAnsi="Georgia"/>
+            <w:b w:val="false"/>
+            <w:bCs w:val="false"/>
+            <w:i w:val="false"/>
+            <w:iCs w:val="false"/>
+            <w:sz w:val="26"/>
+            <w:szCs w:val="26"/>
+          </w:rPr>
+          <w:t xml:space="preserve">🔌 EV Charging Policy Workshop</w:t>
+        </w:r>
+      </w:hyperlink>
+      <w:r>
+        <w:rPr>
+          <w:rFonts w:ascii="Georgia" w:cs="Georgia" w:eastAsia="Georgia" w:hAnsi="Georgia"/>
+          <w:b w:val="false"/>
+          <w:bCs w:val="false"/>
+          <w:i w:val="false"/>
+          <w:iCs w:val="false"/>
+          <w:sz w:val="26"/>
+          <w:szCs w:val="26"/>
+        </w:rPr>
+        <w:t xml:space="preserve">: Sep 2</w:t>
       </w:r>
     </w:p>
     <w:p>
@@ -1231,32 +1231,32 @@
         </w:numPr>
         <w:spacing w:after="140" w:line="300"/>
       </w:pPr>
-      <w:hyperlink w:history="1" r:id="rIddi-coyl1vx6dmfkuyxv5a">
-        <w:r>
-          <w:rPr>
-            <w:rStyle w:val="Hyperlink"/>
-            <w:rFonts w:ascii="Georgia" w:cs="Georgia" w:eastAsia="Georgia" w:hAnsi="Georgia"/>
-            <w:b w:val="false"/>
-            <w:bCs w:val="false"/>
-            <w:i w:val="false"/>
-            <w:iCs w:val="false"/>
-            <w:sz w:val="26"/>
-            <w:szCs w:val="26"/>
-          </w:rPr>
-          <w:t xml:space="preserve">♻️ Circular Economy Roundtable</w:t>
-        </w:r>
-      </w:hyperlink>
-      <w:r>
-        <w:rPr>
-          <w:rFonts w:ascii="Georgia" w:cs="Georgia" w:eastAsia="Georgia" w:hAnsi="Georgia"/>
-          <w:b w:val="false"/>
-          <w:bCs w:val="false"/>
-          <w:i w:val="false"/>
-          <w:iCs w:val="false"/>
-          <w:sz w:val="26"/>
-          <w:szCs w:val="26"/>
-        </w:rPr>
-        <w:t xml:space="preserve">: Sep 8</w:t>
+      <w:hyperlink w:history="1" r:id="rId42r6_cjumjzz409wf94f3">
+        <w:r>
+          <w:rPr>
+            <w:rStyle w:val="Hyperlink"/>
+            <w:rFonts w:ascii="Georgia" w:cs="Georgia" w:eastAsia="Georgia" w:hAnsi="Georgia"/>
+            <w:b w:val="false"/>
+            <w:bCs w:val="false"/>
+            <w:i w:val="false"/>
+            <w:iCs w:val="false"/>
+            <w:sz w:val="26"/>
+            <w:szCs w:val="26"/>
+          </w:rPr>
+          <w:t xml:space="preserve">🎭 Cascadia Climate Storytelling Night</w:t>
+        </w:r>
+      </w:hyperlink>
+      <w:r>
+        <w:rPr>
+          <w:rFonts w:ascii="Georgia" w:cs="Georgia" w:eastAsia="Georgia" w:hAnsi="Georgia"/>
+          <w:b w:val="false"/>
+          <w:bCs w:val="false"/>
+          <w:i w:val="false"/>
+          <w:iCs w:val="false"/>
+          <w:sz w:val="26"/>
+          <w:szCs w:val="26"/>
+        </w:rPr>
+        <w:t xml:space="preserve">: Sep 3</w:t>
       </w:r>
     </w:p>
     <w:p>
@@ -1268,32 +1268,32 @@
         </w:numPr>
         <w:spacing w:after="140" w:line="300"/>
       </w:pPr>
-      <w:hyperlink w:history="1" r:id="rIdaa-putfucwxt04ya17qdl">
-        <w:r>
-          <w:rPr>
-            <w:rStyle w:val="Hyperlink"/>
-            <w:rFonts w:ascii="Georgia" w:cs="Georgia" w:eastAsia="Georgia" w:hAnsi="Georgia"/>
-            <w:b w:val="false"/>
-            <w:bCs w:val="false"/>
-            <w:i w:val="false"/>
-            <w:iCs w:val="false"/>
-            <w:sz w:val="26"/>
-            <w:szCs w:val="26"/>
-          </w:rPr>
-          <w:t xml:space="preserve">🔌 EV Charging Policy Workshop</w:t>
-        </w:r>
-      </w:hyperlink>
-      <w:r>
-        <w:rPr>
-          <w:rFonts w:ascii="Georgia" w:cs="Georgia" w:eastAsia="Georgia" w:hAnsi="Georgia"/>
-          <w:b w:val="false"/>
-          <w:bCs w:val="false"/>
-          <w:i w:val="false"/>
-          <w:iCs w:val="false"/>
-          <w:sz w:val="26"/>
-          <w:szCs w:val="26"/>
-        </w:rPr>
-        <w:t xml:space="preserve">: Sep 10</w:t>
+      <w:hyperlink w:history="1" r:id="rIdwdqkddsk2ioxcxba1tisl">
+        <w:r>
+          <w:rPr>
+            <w:rStyle w:val="Hyperlink"/>
+            <w:rFonts w:ascii="Georgia" w:cs="Georgia" w:eastAsia="Georgia" w:hAnsi="Georgia"/>
+            <w:b w:val="false"/>
+            <w:bCs w:val="false"/>
+            <w:i w:val="false"/>
+            <w:iCs w:val="false"/>
+            <w:sz w:val="26"/>
+            <w:szCs w:val="26"/>
+          </w:rPr>
+          <w:t xml:space="preserve">🌱 Soil Carbon Field Day</w:t>
+        </w:r>
+      </w:hyperlink>
+      <w:r>
+        <w:rPr>
+          <w:rFonts w:ascii="Georgia" w:cs="Georgia" w:eastAsia="Georgia" w:hAnsi="Georgia"/>
+          <w:b w:val="false"/>
+          <w:bCs w:val="false"/>
+          <w:i w:val="false"/>
+          <w:iCs w:val="false"/>
+          <w:sz w:val="26"/>
+          <w:szCs w:val="26"/>
+        </w:rPr>
+        <w:t xml:space="preserve">: Sep 4</w:t>
       </w:r>
     </w:p>
     <w:p>
@@ -1305,32 +1305,32 @@
         </w:numPr>
         <w:spacing w:after="140" w:line="300"/>
       </w:pPr>
-      <w:hyperlink w:history="1" r:id="rIdm0l3epuse_wqps4tmsol8">
-        <w:r>
-          <w:rPr>
-            <w:rStyle w:val="Hyperlink"/>
-            <w:rFonts w:ascii="Georgia" w:cs="Georgia" w:eastAsia="Georgia" w:hAnsi="Georgia"/>
-            <w:b w:val="false"/>
-            <w:bCs w:val="false"/>
-            <w:i w:val="false"/>
-            <w:iCs w:val="false"/>
-            <w:sz w:val="26"/>
-            <w:szCs w:val="26"/>
-          </w:rPr>
-          <w:t xml:space="preserve">🎭 Cascadia Climate Storytelling Night</w:t>
-        </w:r>
-      </w:hyperlink>
-      <w:r>
-        <w:rPr>
-          <w:rFonts w:ascii="Georgia" w:cs="Georgia" w:eastAsia="Georgia" w:hAnsi="Georgia"/>
-          <w:b w:val="false"/>
-          <w:bCs w:val="false"/>
-          <w:i w:val="false"/>
-          <w:iCs w:val="false"/>
-          <w:sz w:val="26"/>
-          <w:szCs w:val="26"/>
-        </w:rPr>
-        <w:t xml:space="preserve">: Sep 15</w:t>
+      <w:hyperlink w:history="1" r:id="rIdwgilthz2mwqspgmdnp4kt">
+        <w:r>
+          <w:rPr>
+            <w:rStyle w:val="Hyperlink"/>
+            <w:rFonts w:ascii="Georgia" w:cs="Georgia" w:eastAsia="Georgia" w:hAnsi="Georgia"/>
+            <w:b w:val="false"/>
+            <w:bCs w:val="false"/>
+            <w:i w:val="false"/>
+            <w:iCs w:val="false"/>
+            <w:sz w:val="26"/>
+            <w:szCs w:val="26"/>
+          </w:rPr>
+          <w:t xml:space="preserve">♻️ Circular Economy Roundtable</w:t>
+        </w:r>
+      </w:hyperlink>
+      <w:r>
+        <w:rPr>
+          <w:rFonts w:ascii="Georgia" w:cs="Georgia" w:eastAsia="Georgia" w:hAnsi="Georgia"/>
+          <w:b w:val="false"/>
+          <w:bCs w:val="false"/>
+          <w:i w:val="false"/>
+          <w:iCs w:val="false"/>
+          <w:sz w:val="26"/>
+          <w:szCs w:val="26"/>
+        </w:rPr>
+        <w:t xml:space="preserve">: Sep 8</w:t>
       </w:r>
     </w:p>
     <w:p>
@@ -1342,7 +1342,7 @@
         </w:numPr>
         <w:spacing w:after="140" w:line="300"/>
       </w:pPr>
-      <w:hyperlink w:history="1" r:id="rIdgln5p44ozbdl9uyadjyle">
+      <w:hyperlink w:history="1" r:id="rIdkbta9w-lhgvhm1y0iw7jq">
         <w:r>
           <w:rPr>
             <w:rStyle w:val="Hyperlink"/>
@@ -1367,7 +1367,7 @@
           <w:sz w:val="26"/>
           <w:szCs w:val="26"/>
         </w:rPr>
-        <w:t xml:space="preserve">: Sep 18</w:t>
+        <w:t xml:space="preserve">: Sep 8</w:t>
       </w:r>
     </w:p>
     <w:p>
@@ -1379,7 +1379,7 @@
         </w:numPr>
         <w:spacing w:after="140" w:line="300"/>
       </w:pPr>
-      <w:hyperlink w:history="1" r:id="rIdfrm3koiaxkh5mpkj8zb3d">
+      <w:hyperlink w:history="1" r:id="rIdqra-rzanxa1mohuoxqet_">
         <w:r>
           <w:rPr>
             <w:rStyle w:val="Hyperlink"/>
@@ -1404,7 +1404,7 @@
           <w:sz w:val="26"/>
           <w:szCs w:val="26"/>
         </w:rPr>
-        <w:t xml:space="preserve">: Sep 26</w:t>
+        <w:t xml:space="preserve">: Sep 8</w:t>
       </w:r>
     </w:p>
     <w:p>
@@ -1436,7 +1436,7 @@
         <w:pStyle w:val="Heading3"/>
         <w:spacing w:after="120" w:before="320"/>
       </w:pPr>
-      <w:hyperlink w:history="1" r:id="rIdctkp3xhnhi8ei_k--w-zi">
+      <w:hyperlink w:history="1" r:id="rIdlwmwtqov_0ejvxungo7xn">
         <w:r>
           <w:rPr>
             <w:rStyle w:val="Hyperlink"/>
@@ -1534,7 +1534,7 @@
         <w:pStyle w:val="Heading3"/>
         <w:spacing w:after="120" w:before="320"/>
       </w:pPr>
-      <w:hyperlink w:history="1" r:id="rIdokwvtoyr-roj5gtvsw_xc">
+      <w:hyperlink w:history="1" r:id="rIdvkmkerbuawkcgzkcsopmt">
         <w:r>
           <w:rPr>
             <w:rStyle w:val="Hyperlink"/>
@@ -1632,7 +1632,7 @@
         <w:pStyle w:val="Heading3"/>
         <w:spacing w:after="120" w:before="320"/>
       </w:pPr>
-      <w:hyperlink w:history="1" r:id="rIdqwb73lt8e9w61zwyufz4z">
+      <w:hyperlink w:history="1" r:id="rIdea4hyl4rvhcgjg8khrnbg">
         <w:r>
           <w:rPr>
             <w:rStyle w:val="Hyperlink"/>
@@ -1730,7 +1730,7 @@
         <w:pStyle w:val="Heading3"/>
         <w:spacing w:after="120" w:before="320"/>
       </w:pPr>
-      <w:hyperlink w:history="1" r:id="rIda48ayn0admmlnby19y6_b">
+      <w:hyperlink w:history="1" r:id="rIdvnsvqzs3fcwbbzlgbfoix">
         <w:r>
           <w:rPr>
             <w:rStyle w:val="Hyperlink"/>
@@ -1828,7 +1828,7 @@
         <w:pStyle w:val="Heading3"/>
         <w:spacing w:after="120" w:before="320"/>
       </w:pPr>
-      <w:hyperlink w:history="1" r:id="rIdxwjc2zqrmq5bvcy5e-7s2">
+      <w:hyperlink w:history="1" r:id="rIdqyiymgnk4wo0deltuo1_u">
         <w:r>
           <w:rPr>
             <w:rStyle w:val="Hyperlink"/>
@@ -1926,7 +1926,7 @@
         <w:pStyle w:val="Heading3"/>
         <w:spacing w:after="120" w:before="320"/>
       </w:pPr>
-      <w:hyperlink w:history="1" r:id="rIduhjnf0vre1qeis-onc86f">
+      <w:hyperlink w:history="1" r:id="rIdcsagagu_bl_nsnd2fk5dq">
         <w:r>
           <w:rPr>
             <w:rStyle w:val="Hyperlink"/>
@@ -2024,7 +2024,7 @@
         <w:pStyle w:val="Heading3"/>
         <w:spacing w:after="120" w:before="320"/>
       </w:pPr>
-      <w:hyperlink w:history="1" r:id="rIdihevwhgwze49bkip33trz">
+      <w:hyperlink w:history="1" r:id="rIdwalv5hdozjigfost409fp">
         <w:r>
           <w:rPr>
             <w:rStyle w:val="Hyperlink"/>
@@ -2122,7 +2122,7 @@
         <w:pStyle w:val="Heading3"/>
         <w:spacing w:after="120" w:before="320"/>
       </w:pPr>
-      <w:hyperlink w:history="1" r:id="rIdplg91unx_ftmzx4t8ux3-">
+      <w:hyperlink w:history="1" r:id="rId40pj46q5je66oawxqg3nq">
         <w:r>
           <w:rPr>
             <w:rStyle w:val="Hyperlink"/>
@@ -2220,7 +2220,7 @@
         <w:pStyle w:val="Heading3"/>
         <w:spacing w:after="120" w:before="320"/>
       </w:pPr>
-      <w:hyperlink w:history="1" r:id="rIdu8pcxy3oy3dydykwp2qbm">
+      <w:hyperlink w:history="1" r:id="rIdzzaex8p56l18lkkl-btl7">
         <w:r>
           <w:rPr>
             <w:rStyle w:val="Hyperlink"/>
@@ -2369,7 +2369,7 @@
         </w:rPr>
         <w:t xml:space="preserve">Running something climate-related in the city? We'd love to spread the word. Tell us about it and it goes into next week's list. </w:t>
       </w:r>
-      <w:hyperlink w:history="1" r:id="rIdt631e66d1xife9jm0lb_t">
+      <w:hyperlink w:history="1" r:id="rIdugrwxkfpjvopjetob5o6n">
         <w:r>
           <w:rPr>
             <w:rStyle w:val="Hyperlink"/>
@@ -2417,7 +2417,7 @@
         </w:rPr>
         <w:t xml:space="preserve">Climate Tech Cities runs on volunteers. If you want to help with events, the newsletter, or the chapter itself, say hello. </w:t>
       </w:r>
-      <w:hyperlink w:history="1" r:id="rIdqzxpqp-4ap4isjo_yuxev">
+      <w:hyperlink w:history="1" r:id="rIdwvjplwoafqhvy9nc3ddtk">
         <w:r>
           <w:rPr>
             <w:rStyle w:val="Hyperlink"/>

</xml_diff>